<commit_message>
Update Lab 4: replaced behavioral diagrams and updated Version4.docx
</commit_message>
<xml_diff>
--- a/Version4.docx
+++ b/Version4.docx
@@ -5222,10 +5222,7 @@
         <w:t xml:space="preserve"> </w:t>
       </w:r>
       <w:r>
-        <w:t xml:space="preserve">User triggers </w:t>
-      </w:r>
-      <w:r>
-        <w:t>Complete Task</w:t>
+        <w:t>User triggers Complete Task</w:t>
       </w:r>
     </w:p>
     <w:p>
@@ -5250,13 +5247,7 @@
         <w:t xml:space="preserve"> </w:t>
       </w:r>
       <w:r>
-        <w:t xml:space="preserve">The system shall prompt for confirmation, </w:t>
-      </w:r>
-      <w:r>
-        <w:t xml:space="preserve">update the status to 'Completed </w:t>
-      </w:r>
-      <w:r>
-        <w:t>' and move the item to the Archive view</w:t>
+        <w:t>The system shall prompt for confirmation, update the status to 'Completed ' and move the item to the Archive view</w:t>
       </w:r>
     </w:p>
     <w:p>
@@ -6982,10 +6973,10 @@
           <w:noProof/>
         </w:rPr>
         <w:drawing>
-          <wp:inline distT="0" distB="0" distL="0" distR="0" wp14:anchorId="5B31AE57" wp14:editId="317413A4">
-            <wp:extent cx="2425065" cy="4517515"/>
-            <wp:effectExtent l="0" t="0" r="0" b="0"/>
-            <wp:docPr id="3" name="Рисунок 3"/>
+          <wp:inline distT="0" distB="0" distL="0" distR="0" wp14:anchorId="124CACF1" wp14:editId="20118830">
+            <wp:extent cx="5731510" cy="1782445"/>
+            <wp:effectExtent l="0" t="0" r="2540" b="8255"/>
+            <wp:docPr id="4" name="Рисунок 4"/>
             <wp:cNvGraphicFramePr>
               <a:graphicFrameLocks xmlns:a="http://schemas.openxmlformats.org/drawingml/2006/main" noChangeAspect="1"/>
             </wp:cNvGraphicFramePr>
@@ -7005,7 +6996,7 @@
                   <pic:spPr>
                     <a:xfrm>
                       <a:off x="0" y="0"/>
-                      <a:ext cx="2436236" cy="4538326"/>
+                      <a:ext cx="5731510" cy="1782445"/>
                     </a:xfrm>
                     <a:prstGeom prst="rect">
                       <a:avLst/>
@@ -7017,202 +7008,6 @@
           </wp:inline>
         </w:drawing>
       </w:r>
-      <w:bookmarkStart w:id="0" w:name="_GoBack"/>
-      <w:bookmarkEnd w:id="0"/>
-    </w:p>
-    <w:p>
-      <w:pPr>
-        <w:spacing w:after="0" w:line="240" w:lineRule="auto"/>
-        <w:rPr>
-          <w:rFonts w:ascii="Times New Roman" w:eastAsia="Times New Roman" w:hAnsi="Times New Roman" w:cs="Times New Roman"/>
-          <w:kern w:val="0"/>
-          <w:lang w:val="en-US"/>
-          <w14:ligatures w14:val="none"/>
-        </w:rPr>
-      </w:pPr>
-      <w:r>
-        <w:rPr>
-          <w:rFonts w:ascii="Times New Roman" w:eastAsia="Times New Roman" w:hAnsi="Times New Roman" w:cs="Times New Roman"/>
-          <w:kern w:val="0"/>
-          <w:lang w:val="en-US"/>
-          <w14:ligatures w14:val="none"/>
-        </w:rPr>
-        <w:t xml:space="preserve">The workflow initiates with the </w:t>
-      </w:r>
-      <w:r>
-        <w:rPr>
-          <w:rFonts w:ascii="Times New Roman" w:eastAsia="Times New Roman" w:hAnsi="Times New Roman" w:cs="Times New Roman"/>
-          <w:bCs/>
-          <w:kern w:val="0"/>
-          <w:lang w:val="en-US"/>
-          <w14:ligatures w14:val="none"/>
-        </w:rPr>
-        <w:t>Task Creation</w:t>
-      </w:r>
-      <w:r>
-        <w:rPr>
-          <w:rFonts w:ascii="Times New Roman" w:eastAsia="Times New Roman" w:hAnsi="Times New Roman" w:cs="Times New Roman"/>
-          <w:kern w:val="0"/>
-          <w:lang w:val="en-US"/>
-          <w14:ligatures w14:val="none"/>
-        </w:rPr>
-        <w:t xml:space="preserve"> phase. Once a task </w:t>
-      </w:r>
-      <w:proofErr w:type="gramStart"/>
-      <w:r>
-        <w:rPr>
-          <w:rFonts w:ascii="Times New Roman" w:eastAsia="Times New Roman" w:hAnsi="Times New Roman" w:cs="Times New Roman"/>
-          <w:kern w:val="0"/>
-          <w:lang w:val="en-US"/>
-          <w14:ligatures w14:val="none"/>
-        </w:rPr>
-        <w:t>is initialized</w:t>
-      </w:r>
-      <w:proofErr w:type="gramEnd"/>
-      <w:r>
-        <w:rPr>
-          <w:rFonts w:ascii="Times New Roman" w:eastAsia="Times New Roman" w:hAnsi="Times New Roman" w:cs="Times New Roman"/>
-          <w:kern w:val="0"/>
-          <w:lang w:val="en-US"/>
-          <w14:ligatures w14:val="none"/>
-        </w:rPr>
-        <w:t xml:space="preserve">, the system enters an optional </w:t>
-      </w:r>
-      <w:r>
-        <w:rPr>
-          <w:rFonts w:ascii="Times New Roman" w:eastAsia="Times New Roman" w:hAnsi="Times New Roman" w:cs="Times New Roman"/>
-          <w:bCs/>
-          <w:kern w:val="0"/>
-          <w:lang w:val="en-US"/>
-          <w14:ligatures w14:val="none"/>
-        </w:rPr>
-        <w:t>Configuration</w:t>
-      </w:r>
-      <w:r>
-        <w:rPr>
-          <w:rFonts w:ascii="Times New Roman" w:eastAsia="Times New Roman" w:hAnsi="Times New Roman" w:cs="Times New Roman"/>
-          <w:kern w:val="0"/>
-          <w:lang w:val="en-US"/>
-          <w14:ligatures w14:val="none"/>
-        </w:rPr>
-        <w:t xml:space="preserve"> branch: if the user chooses to add further details, they are prompted to define specific deadlines and priority levels; otherwise, the system proceeds directly to </w:t>
-      </w:r>
-      <w:r>
-        <w:rPr>
-          <w:rFonts w:ascii="Times New Roman" w:eastAsia="Times New Roman" w:hAnsi="Times New Roman" w:cs="Times New Roman"/>
-          <w:bCs/>
-          <w:kern w:val="0"/>
-          <w:lang w:val="en-US"/>
-          <w14:ligatures w14:val="none"/>
-        </w:rPr>
-        <w:t>Save Task</w:t>
-      </w:r>
-      <w:r>
-        <w:rPr>
-          <w:rFonts w:ascii="Times New Roman" w:eastAsia="Times New Roman" w:hAnsi="Times New Roman" w:cs="Times New Roman"/>
-          <w:kern w:val="0"/>
-          <w:lang w:val="en-US"/>
-          <w14:ligatures w14:val="none"/>
-        </w:rPr>
-        <w:t>.</w:t>
-      </w:r>
-    </w:p>
-    <w:p>
-      <w:pPr>
-        <w:spacing w:after="0" w:line="240" w:lineRule="auto"/>
-        <w:rPr>
-          <w:rFonts w:ascii="Times New Roman" w:eastAsia="Times New Roman" w:hAnsi="Times New Roman" w:cs="Times New Roman"/>
-          <w:kern w:val="0"/>
-          <w:lang w:val="en-US"/>
-          <w14:ligatures w14:val="none"/>
-        </w:rPr>
-      </w:pPr>
-      <w:r>
-        <w:rPr>
-          <w:rFonts w:ascii="Times New Roman" w:eastAsia="Times New Roman" w:hAnsi="Times New Roman" w:cs="Times New Roman"/>
-          <w:kern w:val="0"/>
-          <w:lang w:val="en-US"/>
-          <w14:ligatures w14:val="none"/>
-        </w:rPr>
-        <w:t xml:space="preserve">Following the persistence of the data, the user </w:t>
-      </w:r>
-      <w:proofErr w:type="gramStart"/>
-      <w:r>
-        <w:rPr>
-          <w:rFonts w:ascii="Times New Roman" w:eastAsia="Times New Roman" w:hAnsi="Times New Roman" w:cs="Times New Roman"/>
-          <w:kern w:val="0"/>
-          <w:lang w:val="en-US"/>
-          <w14:ligatures w14:val="none"/>
-        </w:rPr>
-        <w:t>is directed</w:t>
-      </w:r>
-      <w:proofErr w:type="gramEnd"/>
-      <w:r>
-        <w:rPr>
-          <w:rFonts w:ascii="Times New Roman" w:eastAsia="Times New Roman" w:hAnsi="Times New Roman" w:cs="Times New Roman"/>
-          <w:kern w:val="0"/>
-          <w:lang w:val="en-US"/>
-          <w14:ligatures w14:val="none"/>
-        </w:rPr>
-        <w:t xml:space="preserve"> to the </w:t>
-      </w:r>
-      <w:r>
-        <w:rPr>
-          <w:rFonts w:ascii="Times New Roman" w:eastAsia="Times New Roman" w:hAnsi="Times New Roman" w:cs="Times New Roman"/>
-          <w:bCs/>
-          <w:kern w:val="0"/>
-          <w:lang w:val="en-US"/>
-          <w14:ligatures w14:val="none"/>
-        </w:rPr>
-        <w:t>Task List View</w:t>
-      </w:r>
-      <w:r>
-        <w:rPr>
-          <w:rFonts w:ascii="Times New Roman" w:eastAsia="Times New Roman" w:hAnsi="Times New Roman" w:cs="Times New Roman"/>
-          <w:kern w:val="0"/>
-          <w:lang w:val="en-US"/>
-          <w14:ligatures w14:val="none"/>
-        </w:rPr>
-        <w:t xml:space="preserve">. This stage represents the primary operational state where the user monitors active items. A conditional loop is present at the </w:t>
-      </w:r>
-      <w:r>
-        <w:rPr>
-          <w:rFonts w:ascii="Times New Roman" w:eastAsia="Times New Roman" w:hAnsi="Times New Roman" w:cs="Times New Roman"/>
-          <w:bCs/>
-          <w:kern w:val="0"/>
-          <w:lang w:val="en-US"/>
-          <w14:ligatures w14:val="none"/>
-        </w:rPr>
-        <w:t>Completion Decision</w:t>
-      </w:r>
-      <w:r>
-        <w:rPr>
-          <w:rFonts w:ascii="Times New Roman" w:eastAsia="Times New Roman" w:hAnsi="Times New Roman" w:cs="Times New Roman"/>
-          <w:kern w:val="0"/>
-          <w:lang w:val="en-US"/>
-          <w14:ligatures w14:val="none"/>
-        </w:rPr>
-        <w:t xml:space="preserve"> point: if a task is not ready for completion, the user remains within the task list. Once a user triggers the completion action, the system executes the </w:t>
-      </w:r>
-      <w:r>
-        <w:rPr>
-          <w:rFonts w:ascii="Times New Roman" w:eastAsia="Times New Roman" w:hAnsi="Times New Roman" w:cs="Times New Roman"/>
-          <w:bCs/>
-          <w:kern w:val="0"/>
-          <w:lang w:val="en-US"/>
-          <w14:ligatures w14:val="none"/>
-        </w:rPr>
-        <w:t>Mark as Completed</w:t>
-      </w:r>
-      <w:r>
-        <w:rPr>
-          <w:rFonts w:ascii="Times New Roman" w:eastAsia="Times New Roman" w:hAnsi="Times New Roman" w:cs="Times New Roman"/>
-          <w:kern w:val="0"/>
-          <w:lang w:val="en-US"/>
-          <w14:ligatures w14:val="none"/>
-        </w:rPr>
-        <w:t xml:space="preserve"> function and concludes the process for that specific task entry</w:t>
-      </w:r>
     </w:p>
     <w:p>
       <w:pPr>
@@ -7246,12 +7041,124 @@
       <w:pPr>
         <w:pStyle w:val="ac"/>
         <w:spacing w:before="0" w:beforeAutospacing="0" w:after="0" w:afterAutospacing="0"/>
-        <w:jc w:val="center"/>
+        <w:jc w:val="both"/>
         <w:rPr>
           <w:color w:val="2B2D38"/>
           <w:shd w:val="clear" w:color="auto" w:fill="FFFFFF"/>
         </w:rPr>
       </w:pPr>
+      <w:r>
+        <w:t xml:space="preserve">A task starts as </w:t>
+      </w:r>
+      <w:r>
+        <w:rPr>
+          <w:bCs/>
+        </w:rPr>
+        <w:t>Pending</w:t>
+      </w:r>
+      <w:r>
+        <w:t xml:space="preserve"> and moves to </w:t>
+      </w:r>
+      <w:r>
+        <w:rPr>
+          <w:bCs/>
+        </w:rPr>
+        <w:t>Assigned</w:t>
+      </w:r>
+      <w:r>
+        <w:t xml:space="preserve"> once it's yours, becoming </w:t>
+      </w:r>
+      <w:r>
+        <w:rPr>
+          <w:bCs/>
+        </w:rPr>
+        <w:t>In Progress</w:t>
+      </w:r>
+      <w:r>
+        <w:t xml:space="preserve"> while you work, though you can put it </w:t>
+      </w:r>
+      <w:r>
+        <w:rPr>
+          <w:bCs/>
+        </w:rPr>
+        <w:t>On Hold</w:t>
+      </w:r>
+      <w:r>
+        <w:t xml:space="preserve"> if you need a break. This lifecycle </w:t>
+      </w:r>
+      <w:proofErr w:type="gramStart"/>
+      <w:r>
+        <w:t>is driven</w:t>
+      </w:r>
+      <w:proofErr w:type="gramEnd"/>
+      <w:r>
+        <w:t xml:space="preserve"> by your daily routine, which starts by </w:t>
+      </w:r>
+      <w:r>
+        <w:rPr>
+          <w:bCs/>
+        </w:rPr>
+        <w:t>Reviewing Tasks</w:t>
+      </w:r>
+      <w:r>
+        <w:t xml:space="preserve"> and picking the top priority, then using a</w:t>
+      </w:r>
+      <w:r>
+        <w:t xml:space="preserve"> </w:t>
+      </w:r>
+      <w:r>
+        <w:rPr>
+          <w:bCs/>
+        </w:rPr>
+        <w:t>Fork</w:t>
+      </w:r>
+      <w:r>
+        <w:t xml:space="preserve"> to work and </w:t>
+      </w:r>
+      <w:r>
+        <w:rPr>
+          <w:bCs/>
+        </w:rPr>
+        <w:t>Log Time</w:t>
+      </w:r>
+      <w:r>
+        <w:t xml:space="preserve"> at the same time. These actions meet at a </w:t>
+      </w:r>
+      <w:r>
+        <w:rPr>
+          <w:bCs/>
+        </w:rPr>
+        <w:t>Join</w:t>
+      </w:r>
+      <w:r>
+        <w:t xml:space="preserve"> to </w:t>
+      </w:r>
+      <w:r>
+        <w:rPr>
+          <w:bCs/>
+        </w:rPr>
+        <w:t>Update Status</w:t>
+      </w:r>
+      <w:r>
+        <w:t xml:space="preserve">, where you decide if the job is done; if not, you loop back to keep working, but if it is, you </w:t>
+      </w:r>
+      <w:r>
+        <w:rPr>
+          <w:bCs/>
+        </w:rPr>
+        <w:t>Archive</w:t>
+      </w:r>
+      <w:r>
+        <w:t xml:space="preserve"> it and move to the next task. This simple loop keeps the system updated until every task is finished and </w:t>
+      </w:r>
+      <w:proofErr w:type="gramStart"/>
+      <w:r>
+        <w:t>you’ve</w:t>
+      </w:r>
+      <w:proofErr w:type="gramEnd"/>
+      <w:r>
+        <w:t xml:space="preserve"> checked what's due for tomorrow</w:t>
+      </w:r>
     </w:p>
     <w:p>
       <w:pPr>
@@ -7329,6 +7236,228 @@
           <w:shd w:val="clear" w:color="auto" w:fill="FFFFFF"/>
         </w:rPr>
       </w:pPr>
+    </w:p>
+    <w:p>
+      <w:pPr>
+        <w:pStyle w:val="ac"/>
+        <w:spacing w:before="0" w:beforeAutospacing="0" w:after="0" w:afterAutospacing="0"/>
+        <w:jc w:val="center"/>
+        <w:rPr>
+          <w:color w:val="2B2D38"/>
+          <w:shd w:val="clear" w:color="auto" w:fill="FFFFFF"/>
+        </w:rPr>
+      </w:pPr>
+    </w:p>
+    <w:p>
+      <w:pPr>
+        <w:pStyle w:val="ac"/>
+        <w:spacing w:before="0" w:beforeAutospacing="0" w:after="0" w:afterAutospacing="0"/>
+        <w:jc w:val="center"/>
+        <w:rPr>
+          <w:color w:val="2B2D38"/>
+          <w:shd w:val="clear" w:color="auto" w:fill="FFFFFF"/>
+        </w:rPr>
+      </w:pPr>
+    </w:p>
+    <w:p>
+      <w:pPr>
+        <w:pStyle w:val="ac"/>
+        <w:spacing w:before="0" w:beforeAutospacing="0" w:after="0" w:afterAutospacing="0"/>
+        <w:jc w:val="center"/>
+        <w:rPr>
+          <w:color w:val="2B2D38"/>
+          <w:shd w:val="clear" w:color="auto" w:fill="FFFFFF"/>
+        </w:rPr>
+      </w:pPr>
+    </w:p>
+    <w:p>
+      <w:pPr>
+        <w:pStyle w:val="ac"/>
+        <w:spacing w:before="0" w:beforeAutospacing="0" w:after="0" w:afterAutospacing="0"/>
+        <w:jc w:val="center"/>
+        <w:rPr>
+          <w:color w:val="2B2D38"/>
+          <w:shd w:val="clear" w:color="auto" w:fill="FFFFFF"/>
+        </w:rPr>
+      </w:pPr>
+    </w:p>
+    <w:p>
+      <w:pPr>
+        <w:pStyle w:val="ac"/>
+        <w:spacing w:before="0" w:beforeAutospacing="0" w:after="0" w:afterAutospacing="0"/>
+        <w:jc w:val="center"/>
+        <w:rPr>
+          <w:color w:val="2B2D38"/>
+          <w:shd w:val="clear" w:color="auto" w:fill="FFFFFF"/>
+        </w:rPr>
+      </w:pPr>
+    </w:p>
+    <w:p>
+      <w:pPr>
+        <w:pStyle w:val="ac"/>
+        <w:spacing w:before="0" w:beforeAutospacing="0" w:after="0" w:afterAutospacing="0"/>
+        <w:jc w:val="center"/>
+        <w:rPr>
+          <w:color w:val="2B2D38"/>
+          <w:shd w:val="clear" w:color="auto" w:fill="FFFFFF"/>
+        </w:rPr>
+      </w:pPr>
+    </w:p>
+    <w:p>
+      <w:pPr>
+        <w:pStyle w:val="ac"/>
+        <w:spacing w:before="0" w:beforeAutospacing="0" w:after="0" w:afterAutospacing="0"/>
+        <w:jc w:val="center"/>
+        <w:rPr>
+          <w:color w:val="2B2D38"/>
+          <w:shd w:val="clear" w:color="auto" w:fill="FFFFFF"/>
+        </w:rPr>
+      </w:pPr>
+    </w:p>
+    <w:p>
+      <w:pPr>
+        <w:pStyle w:val="ac"/>
+        <w:spacing w:before="0" w:beforeAutospacing="0" w:after="0" w:afterAutospacing="0"/>
+        <w:jc w:val="center"/>
+        <w:rPr>
+          <w:color w:val="2B2D38"/>
+          <w:shd w:val="clear" w:color="auto" w:fill="FFFFFF"/>
+        </w:rPr>
+      </w:pPr>
+    </w:p>
+    <w:p>
+      <w:pPr>
+        <w:pStyle w:val="ac"/>
+        <w:spacing w:before="0" w:beforeAutospacing="0" w:after="0" w:afterAutospacing="0"/>
+        <w:jc w:val="center"/>
+        <w:rPr>
+          <w:color w:val="2B2D38"/>
+          <w:shd w:val="clear" w:color="auto" w:fill="FFFFFF"/>
+        </w:rPr>
+      </w:pPr>
+    </w:p>
+    <w:p>
+      <w:pPr>
+        <w:pStyle w:val="ac"/>
+        <w:spacing w:before="0" w:beforeAutospacing="0" w:after="0" w:afterAutospacing="0"/>
+        <w:jc w:val="center"/>
+        <w:rPr>
+          <w:color w:val="2B2D38"/>
+          <w:shd w:val="clear" w:color="auto" w:fill="FFFFFF"/>
+        </w:rPr>
+      </w:pPr>
+    </w:p>
+    <w:p>
+      <w:pPr>
+        <w:pStyle w:val="ac"/>
+        <w:spacing w:before="0" w:beforeAutospacing="0" w:after="0" w:afterAutospacing="0"/>
+        <w:jc w:val="center"/>
+        <w:rPr>
+          <w:color w:val="2B2D38"/>
+          <w:shd w:val="clear" w:color="auto" w:fill="FFFFFF"/>
+        </w:rPr>
+      </w:pPr>
+    </w:p>
+    <w:p>
+      <w:pPr>
+        <w:pStyle w:val="ac"/>
+        <w:spacing w:before="0" w:beforeAutospacing="0" w:after="0" w:afterAutospacing="0"/>
+        <w:jc w:val="center"/>
+        <w:rPr>
+          <w:color w:val="2B2D38"/>
+          <w:shd w:val="clear" w:color="auto" w:fill="FFFFFF"/>
+        </w:rPr>
+      </w:pPr>
+    </w:p>
+    <w:p>
+      <w:pPr>
+        <w:pStyle w:val="ac"/>
+        <w:spacing w:before="0" w:beforeAutospacing="0" w:after="0" w:afterAutospacing="0"/>
+        <w:jc w:val="center"/>
+        <w:rPr>
+          <w:color w:val="2B2D38"/>
+          <w:shd w:val="clear" w:color="auto" w:fill="FFFFFF"/>
+        </w:rPr>
+      </w:pPr>
+    </w:p>
+    <w:p>
+      <w:pPr>
+        <w:pStyle w:val="ac"/>
+        <w:spacing w:before="0" w:beforeAutospacing="0" w:after="0" w:afterAutospacing="0"/>
+        <w:jc w:val="center"/>
+        <w:rPr>
+          <w:color w:val="2B2D38"/>
+          <w:shd w:val="clear" w:color="auto" w:fill="FFFFFF"/>
+        </w:rPr>
+      </w:pPr>
+    </w:p>
+    <w:p>
+      <w:pPr>
+        <w:pStyle w:val="ac"/>
+        <w:spacing w:before="0" w:beforeAutospacing="0" w:after="0" w:afterAutospacing="0"/>
+        <w:jc w:val="center"/>
+        <w:rPr>
+          <w:color w:val="2B2D38"/>
+          <w:shd w:val="clear" w:color="auto" w:fill="FFFFFF"/>
+        </w:rPr>
+      </w:pPr>
+    </w:p>
+    <w:p>
+      <w:pPr>
+        <w:pStyle w:val="ac"/>
+        <w:spacing w:before="0" w:beforeAutospacing="0" w:after="0" w:afterAutospacing="0"/>
+        <w:jc w:val="center"/>
+        <w:rPr>
+          <w:color w:val="2B2D38"/>
+          <w:shd w:val="clear" w:color="auto" w:fill="FFFFFF"/>
+        </w:rPr>
+      </w:pPr>
+    </w:p>
+    <w:p>
+      <w:pPr>
+        <w:pStyle w:val="ac"/>
+        <w:spacing w:before="0" w:beforeAutospacing="0" w:after="0" w:afterAutospacing="0"/>
+        <w:jc w:val="center"/>
+        <w:rPr>
+          <w:color w:val="2B2D38"/>
+          <w:shd w:val="clear" w:color="auto" w:fill="FFFFFF"/>
+        </w:rPr>
+      </w:pPr>
+    </w:p>
+    <w:p>
+      <w:pPr>
+        <w:pStyle w:val="ac"/>
+        <w:spacing w:before="0" w:beforeAutospacing="0" w:after="0" w:afterAutospacing="0"/>
+        <w:jc w:val="center"/>
+        <w:rPr>
+          <w:color w:val="2B2D38"/>
+          <w:shd w:val="clear" w:color="auto" w:fill="FFFFFF"/>
+        </w:rPr>
+      </w:pPr>
+    </w:p>
+    <w:p>
+      <w:pPr>
+        <w:pStyle w:val="ac"/>
+        <w:spacing w:before="0" w:beforeAutospacing="0" w:after="0" w:afterAutospacing="0"/>
+        <w:jc w:val="center"/>
+        <w:rPr>
+          <w:color w:val="2B2D38"/>
+          <w:shd w:val="clear" w:color="auto" w:fill="FFFFFF"/>
+        </w:rPr>
+      </w:pPr>
+    </w:p>
+    <w:p>
+      <w:pPr>
+        <w:pStyle w:val="ac"/>
+        <w:spacing w:before="0" w:beforeAutospacing="0" w:after="0" w:afterAutospacing="0"/>
+        <w:jc w:val="center"/>
+        <w:rPr>
+          <w:color w:val="2B2D38"/>
+          <w:shd w:val="clear" w:color="auto" w:fill="FFFFFF"/>
+        </w:rPr>
+      </w:pPr>
+      <w:bookmarkStart w:id="0" w:name="_GoBack"/>
+      <w:bookmarkEnd w:id="0"/>
     </w:p>
     <w:p>
       <w:pPr>

</xml_diff>